<commit_message>
fix: corrige DELCARO→DECLARO e adiciona logo+timbre na hipossuficiência
- declaracao-nao-contratacao: typo DELCARO corrigido para DECLARO
- declaracao-hipossuficiencia: adicionado logo dourado (cabeçalho) e timbre
  do escritório (rodapé), que o .docx original não tinha

Co-Authored-By: Claude Opus 4.8 <noreply@anthropic.com>
</commit_message>
<xml_diff>
--- a/public/templates-zapsign-docx/declaracao-hipossuficiencia.docx
+++ b/public/templates-zapsign-docx/declaracao-hipossuficiencia.docx
@@ -632,7 +632,31 @@
   <w:p>
     <w:pPr>
       <w:pStyle w:val="Rodap"/>
+      <w:jc w:val="center"/>
     </w:pPr>
+    <w:r>
+      <w:rPr>
+        <w:color w:val="806010"/>
+        <w:sz w:val="14"/>
+      </w:rPr>
+      <w:t>BENTES RAMOS – ADVOCACIA E CONSULTORIA JURÍDICA</w:t>
+      <w:br/>
+    </w:r>
+    <w:r>
+      <w:rPr>
+        <w:color w:val="806010"/>
+        <w:sz w:val="14"/>
+      </w:rPr>
+      <w:t>End.: Rua Salvador, n˚ 120, sala 708, 7° andar – Edifício Vieiralves Business Center – bairro: Adrianópolis – Manaus/AM – Cep: 69.057-040</w:t>
+      <w:br/>
+    </w:r>
+    <w:r>
+      <w:rPr>
+        <w:color w:val="806010"/>
+        <w:sz w:val="14"/>
+      </w:rPr>
+      <w:t>Tel.: (92) 3343-6173 – Cel.: (92) 98223-7330/ 99160-4348 - E-mail.: juridico@bentesramos.adv.br</w:t>
+    </w:r>
   </w:p>
   <w:p>
     <w:pPr>
@@ -680,7 +704,42 @@
   <w:p>
     <w:pPr>
       <w:pStyle w:val="Cabealho"/>
+      <w:jc w:val="center"/>
     </w:pPr>
+    <w:r>
+      <w:drawing>
+        <wp:inline xmlns:a="http://schemas.openxmlformats.org/drawingml/2006/main" xmlns:pic="http://schemas.openxmlformats.org/drawingml/2006/picture">
+          <wp:extent cx="2103120" cy="993330"/>
+          <wp:docPr id="1" name="Picture 1"/>
+          <wp:cNvGraphicFramePr>
+            <a:graphicFrameLocks noChangeAspect="1"/>
+          </wp:cNvGraphicFramePr>
+          <a:graphic>
+            <a:graphicData uri="http://schemas.openxmlformats.org/drawingml/2006/picture">
+              <pic:pic>
+                <pic:nvPicPr>
+                  <pic:cNvPr id="0" name="tmp_logo_dourado.png"/>
+                  <pic:cNvPicPr/>
+                </pic:nvPicPr>
+                <pic:blipFill>
+                  <a:blip r:embed="rId1"/>
+                  <a:stretch>
+                    <a:fillRect/>
+                  </a:stretch>
+                </pic:blipFill>
+                <pic:spPr>
+                  <a:xfrm>
+                    <a:off x="0" y="0"/>
+                    <a:ext cx="2103120" cy="993330"/>
+                  </a:xfrm>
+                  <a:prstGeom prst="rect"/>
+                </pic:spPr>
+              </pic:pic>
+            </a:graphicData>
+          </a:graphic>
+        </wp:inline>
+      </w:drawing>
+    </w:r>
   </w:p>
   <w:p>
     <w:pPr>

</xml_diff>